<commit_message>
doc: update advisor name on docx
</commit_message>
<xml_diff>
--- a/Thesis.docx
+++ b/Thesis.docx
@@ -343,6 +343,8 @@
           <w:b/>
           <w:bCs/>
           <w:noProof/>
+          <w:sz w:val="28"/>
+          <w:szCs w:val="28"/>
         </w:rPr>
       </w:pPr>
       <w:r>
@@ -350,9 +352,54 @@
           <w:b/>
           <w:bCs/>
           <w:noProof/>
-        </w:rPr>
-        <w:t>Assoc. Prof. Dr. Kemal SEZER</w:t>
-      </w:r>
+          <w:sz w:val="28"/>
+          <w:szCs w:val="28"/>
+        </w:rPr>
+        <w:t>Asst</w:t>
+      </w:r>
+      <w:r>
+        <w:rPr>
+          <w:b/>
+          <w:bCs/>
+          <w:noProof/>
+          <w:sz w:val="28"/>
+          <w:szCs w:val="28"/>
+        </w:rPr>
+        <w:t xml:space="preserve">. Prof. Dr. </w:t>
+      </w:r>
+      <w:r>
+        <w:rPr>
+          <w:b/>
+          <w:bCs/>
+          <w:noProof/>
+          <w:sz w:val="28"/>
+          <w:szCs w:val="28"/>
+        </w:rPr>
+        <w:t xml:space="preserve">Feriştah </w:t>
+      </w:r>
+      <w:r>
+        <w:rPr>
+          <w:b/>
+          <w:bCs/>
+          <w:noProof/>
+          <w:sz w:val="28"/>
+          <w:szCs w:val="28"/>
+        </w:rPr>
+        <w:t>DALKILIÇ</w:t>
+      </w:r>
+    </w:p>
+    <w:p>
+      <w:pPr>
+        <w:suppressAutoHyphens/>
+        <w:spacing w:after="0" w:line="20" w:lineRule="exact"/>
+        <w:ind w:firstLine="0"/>
+        <w:jc w:val="left"/>
+        <w:rPr>
+          <w:noProof/>
+          <w:sz w:val="2"/>
+          <w:szCs w:val="2"/>
+        </w:rPr>
+      </w:pPr>
     </w:p>
     <w:p>
       <w:pPr>
@@ -819,6 +866,8 @@
           <w:b/>
           <w:bCs/>
           <w:noProof/>
+          <w:sz w:val="28"/>
+          <w:szCs w:val="28"/>
         </w:rPr>
       </w:pPr>
       <w:r>
@@ -826,8 +875,10 @@
           <w:b/>
           <w:bCs/>
           <w:noProof/>
-        </w:rPr>
-        <w:t>Assoc. Prof. Dr. Kemal SEZER</w:t>
+          <w:sz w:val="28"/>
+          <w:szCs w:val="28"/>
+        </w:rPr>
+        <w:t>Asst. Prof. Dr. Feriştah DALKILIÇ</w:t>
       </w:r>
     </w:p>
     <w:p>
@@ -9598,7 +9649,6 @@
       </w:pPr>
       <w:proofErr w:type="spellStart"/>
       <w:r>
-        <w:lastRenderedPageBreak/>
         <w:t>Traditional</w:t>
       </w:r>
       <w:proofErr w:type="spellEnd"/>
@@ -11651,7 +11701,6 @@
       </w:r>
       <w:proofErr w:type="spellStart"/>
       <w:r>
-        <w:lastRenderedPageBreak/>
         <w:t>environmental</w:t>
       </w:r>
       <w:proofErr w:type="spellEnd"/>
@@ -13510,7 +13559,6 @@
       </w:pPr>
       <w:proofErr w:type="spellStart"/>
       <w:r>
-        <w:lastRenderedPageBreak/>
         <w:t>To</w:t>
       </w:r>
       <w:proofErr w:type="spellEnd"/>
@@ -14559,7 +14607,6 @@
     <w:p>
       <w:pPr>
         <w:pStyle w:val="Balk2"/>
-        <w:suppressAutoHyphens/>
       </w:pPr>
       <w:r>
         <w:t xml:space="preserve">1.3 </w:t>
@@ -15490,7 +15537,6 @@
       </w:pPr>
       <w:proofErr w:type="spellStart"/>
       <w:r>
-        <w:lastRenderedPageBreak/>
         <w:t>Recent</w:t>
       </w:r>
       <w:proofErr w:type="spellEnd"/>
@@ -16884,7 +16930,6 @@
     <w:p>
       <w:pPr>
         <w:pStyle w:val="Balk2"/>
-        <w:suppressAutoHyphens/>
       </w:pPr>
       <w:r>
         <w:t xml:space="preserve">1.4 </w:t>
@@ -17370,7 +17415,6 @@
       </w:r>
       <w:proofErr w:type="spellStart"/>
       <w:r>
-        <w:lastRenderedPageBreak/>
         <w:t>interact</w:t>
       </w:r>
       <w:proofErr w:type="spellEnd"/>
@@ -19079,7 +19123,6 @@
       </w:pPr>
       <w:proofErr w:type="spellStart"/>
       <w:r>
-        <w:lastRenderedPageBreak/>
         <w:t>Designing</w:t>
       </w:r>
       <w:proofErr w:type="spellEnd"/>
@@ -20675,7 +20718,6 @@
       </w:pPr>
       <w:proofErr w:type="spellStart"/>
       <w:r>
-        <w:lastRenderedPageBreak/>
         <w:t>The</w:t>
       </w:r>
       <w:proofErr w:type="spellEnd"/>
@@ -22619,7 +22661,6 @@
       </w:r>
       <w:proofErr w:type="spellStart"/>
       <w:r>
-        <w:lastRenderedPageBreak/>
         <w:t>information</w:t>
       </w:r>
       <w:proofErr w:type="spellEnd"/>
@@ -24184,7 +24225,6 @@
       </w:pPr>
       <w:proofErr w:type="spellStart"/>
       <w:r>
-        <w:lastRenderedPageBreak/>
         <w:t>Ethical</w:t>
       </w:r>
       <w:proofErr w:type="spellEnd"/>
@@ -25887,7 +25927,6 @@
         <w:suppressAutoHyphens/>
       </w:pPr>
       <w:r>
-        <w:lastRenderedPageBreak/>
         <w:t xml:space="preserve">Technical </w:t>
       </w:r>
       <w:proofErr w:type="spellStart"/>
@@ -27443,13 +27482,8 @@
       <w:fldChar w:fldCharType="separate"/>
     </w:r>
     <w:r>
-      <w:t>ii</w:t>
+      <w:t>iii</w:t>
     </w:r>
-    <w:proofErr w:type="gramStart"/>
-    <w:r>
-      <w:t>i</w:t>
-    </w:r>
-    <w:proofErr w:type="gramEnd"/>
     <w:r>
       <w:fldChar w:fldCharType="end"/>
     </w:r>
@@ -27475,13 +27509,8 @@
       <w:fldChar w:fldCharType="separate"/>
     </w:r>
     <w:r>
-      <w:t>ii</w:t>
+      <w:t>iii</w:t>
     </w:r>
-    <w:proofErr w:type="gramStart"/>
-    <w:r>
-      <w:t>i</w:t>
-    </w:r>
-    <w:proofErr w:type="gramEnd"/>
     <w:r>
       <w:fldChar w:fldCharType="end"/>
     </w:r>
@@ -28179,7 +28208,6 @@
     <w:next w:val="Normal"/>
     <w:link w:val="Balk2Char"/>
     <w:uiPriority w:val="9"/>
-    <w:semiHidden/>
     <w:unhideWhenUsed/>
     <w:qFormat/>
     <w:rsid w:val="00137E02"/>
@@ -28338,7 +28366,6 @@
   <w:style w:type="character" w:default="1" w:styleId="VarsaylanParagrafYazTipi">
     <w:name w:val="Default Paragraph Font"/>
     <w:uiPriority w:val="1"/>
-    <w:semiHidden/>
     <w:unhideWhenUsed/>
   </w:style>
   <w:style w:type="table" w:default="1" w:styleId="NormalTablo">
@@ -28380,7 +28407,6 @@
     <w:basedOn w:val="VarsaylanParagrafYazTipi"/>
     <w:link w:val="Balk2"/>
     <w:uiPriority w:val="9"/>
-    <w:semiHidden/>
     <w:rsid w:val="00137E02"/>
     <w:rPr>
       <w:rFonts w:ascii="Times New Roman" w:eastAsia="Times New Roman" w:hAnsi="Times New Roman" w:cs="Times New Roman"/>

</xml_diff>